<commit_message>
added member contributions and repo link
</commit_message>
<xml_diff>
--- a/report.docx
+++ b/report.docx
@@ -419,23 +419,7 @@
           <w:color w:val="000000" w:themeColor="text1"/>
           <w:lang w:val="en-US"/>
         </w:rPr>
-        <w:t xml:space="preserve"> </w:t>
-      </w:r>
-      <w:r>
-        <w:rPr>
-          <w:rFonts w:ascii="Times New Roman" w:eastAsia="Times New Roman" w:hAnsi="Times New Roman" w:cs="Times New Roman"/>
-          <w:color w:val="000000" w:themeColor="text1"/>
-          <w:lang w:val="en-US"/>
-        </w:rPr>
-        <w:t>Spearman’s two-factor model</w:t>
-      </w:r>
-      <w:r>
-        <w:rPr>
-          <w:rFonts w:ascii="Times New Roman" w:eastAsia="Times New Roman" w:hAnsi="Times New Roman" w:cs="Times New Roman"/>
-          <w:color w:val="000000" w:themeColor="text1"/>
-          <w:lang w:val="en-US"/>
-        </w:rPr>
-        <w:t xml:space="preserve"> </w:t>
+        <w:t xml:space="preserve"> Spearman’s two-factor model </w:t>
       </w:r>
       <w:r>
         <w:rPr>
@@ -916,21 +900,12 @@
           <w:lang w:val="en-US"/>
         </w:rPr>
       </w:pPr>
-      <w:proofErr w:type="gramStart"/>
-      <w:r>
-        <w:rPr>
-          <w:rFonts w:ascii="Times New Roman" w:hAnsi="Times New Roman" w:cs="Times New Roman"/>
-          <w:lang w:val="en-US"/>
-        </w:rPr>
-        <w:t>First</w:t>
-      </w:r>
-      <w:proofErr w:type="gramEnd"/>
-      <w:r>
-        <w:rPr>
-          <w:rFonts w:ascii="Times New Roman" w:hAnsi="Times New Roman" w:cs="Times New Roman"/>
-          <w:lang w:val="en-US"/>
-        </w:rPr>
-        <w:t xml:space="preserve"> </w:t>
+      <w:r>
+        <w:rPr>
+          <w:rFonts w:ascii="Times New Roman" w:hAnsi="Times New Roman" w:cs="Times New Roman"/>
+          <w:lang w:val="en-US"/>
+        </w:rPr>
+        <w:t xml:space="preserve">First </w:t>
       </w:r>
       <w:r>
         <w:rPr>
@@ -1309,7 +1284,14 @@
                       <w:rFonts w:ascii="Cambria Math" w:eastAsiaTheme="minorEastAsia" w:hAnsi="Cambria Math" w:cs="Times New Roman"/>
                       <w:lang w:val="en-US"/>
                     </w:rPr>
-                    <m:t>j=1</m:t>
+                    <m:t>j</m:t>
+                  </m:r>
+                  <m:r>
+                    <w:rPr>
+                      <w:rFonts w:ascii="Cambria Math" w:eastAsiaTheme="minorEastAsia" w:hAnsi="Cambria Math" w:cs="Times New Roman"/>
+                      <w:lang w:val="en-US"/>
+                    </w:rPr>
+                    <m:t>=1</m:t>
                   </m:r>
                 </m:e>
                 <m:e>
@@ -1318,7 +1300,21 @@
                       <w:rFonts w:ascii="Cambria Math" w:eastAsiaTheme="minorEastAsia" w:hAnsi="Cambria Math" w:cs="Times New Roman"/>
                       <w:lang w:val="en-US"/>
                     </w:rPr>
-                    <m:t>j≠i</m:t>
+                    <m:t>j</m:t>
+                  </m:r>
+                  <m:r>
+                    <w:rPr>
+                      <w:rFonts w:ascii="Cambria Math" w:eastAsiaTheme="minorEastAsia" w:hAnsi="Cambria Math" w:cs="Times New Roman"/>
+                      <w:lang w:val="en-US"/>
+                    </w:rPr>
+                    <m:t>≠</m:t>
+                  </m:r>
+                  <m:r>
+                    <w:rPr>
+                      <w:rFonts w:ascii="Cambria Math" w:eastAsiaTheme="minorEastAsia" w:hAnsi="Cambria Math" w:cs="Times New Roman"/>
+                      <w:lang w:val="en-US"/>
+                    </w:rPr>
+                    <m:t>i</m:t>
                   </m:r>
                 </m:e>
               </m:eqArr>
@@ -1471,14 +1467,56 @@
               <w:rFonts w:ascii="Cambria Math" w:eastAsiaTheme="minorEastAsia" w:hAnsi="Cambria Math" w:cs="Times New Roman"/>
               <w:lang w:val="en-US"/>
             </w:rPr>
-            <m:t xml:space="preserve">   for i,j=1</m:t>
+            <m:t xml:space="preserve">   </m:t>
           </m:r>
           <m:r>
             <w:rPr>
               <w:rFonts w:ascii="Cambria Math" w:eastAsiaTheme="minorEastAsia" w:hAnsi="Cambria Math" w:cs="Times New Roman"/>
               <w:lang w:val="en-US"/>
             </w:rPr>
-            <m:t>…W</m:t>
+            <m:t>for</m:t>
+          </m:r>
+          <m:r>
+            <w:rPr>
+              <w:rFonts w:ascii="Cambria Math" w:eastAsiaTheme="minorEastAsia" w:hAnsi="Cambria Math" w:cs="Times New Roman"/>
+              <w:lang w:val="en-US"/>
+            </w:rPr>
+            <m:t xml:space="preserve"> </m:t>
+          </m:r>
+          <m:r>
+            <w:rPr>
+              <w:rFonts w:ascii="Cambria Math" w:eastAsiaTheme="minorEastAsia" w:hAnsi="Cambria Math" w:cs="Times New Roman"/>
+              <w:lang w:val="en-US"/>
+            </w:rPr>
+            <m:t>i</m:t>
+          </m:r>
+          <m:r>
+            <w:rPr>
+              <w:rFonts w:ascii="Cambria Math" w:eastAsiaTheme="minorEastAsia" w:hAnsi="Cambria Math" w:cs="Times New Roman"/>
+              <w:lang w:val="en-US"/>
+            </w:rPr>
+            <m:t>,</m:t>
+          </m:r>
+          <m:r>
+            <w:rPr>
+              <w:rFonts w:ascii="Cambria Math" w:eastAsiaTheme="minorEastAsia" w:hAnsi="Cambria Math" w:cs="Times New Roman"/>
+              <w:lang w:val="en-US"/>
+            </w:rPr>
+            <m:t>j</m:t>
+          </m:r>
+          <m:r>
+            <w:rPr>
+              <w:rFonts w:ascii="Cambria Math" w:eastAsiaTheme="minorEastAsia" w:hAnsi="Cambria Math" w:cs="Times New Roman"/>
+              <w:lang w:val="en-US"/>
+            </w:rPr>
+            <m:t>=1…</m:t>
+          </m:r>
+          <m:r>
+            <w:rPr>
+              <w:rFonts w:ascii="Cambria Math" w:eastAsiaTheme="minorEastAsia" w:hAnsi="Cambria Math" w:cs="Times New Roman"/>
+              <w:lang w:val="en-US"/>
+            </w:rPr>
+            <m:t>W</m:t>
           </m:r>
         </m:oMath>
       </m:oMathPara>
@@ -3341,14 +3379,7 @@
                 <w:rFonts w:ascii="Cambria Math" w:eastAsiaTheme="minorEastAsia" w:hAnsi="Cambria Math" w:cs="Times New Roman"/>
                 <w:lang w:val="en-US"/>
               </w:rPr>
-              <m:t>x</m:t>
-            </m:r>
-            <m:r>
-              <w:rPr>
-                <w:rFonts w:ascii="Cambria Math" w:eastAsiaTheme="minorEastAsia" w:hAnsi="Cambria Math" w:cs="Times New Roman"/>
-                <w:lang w:val="en-US"/>
-              </w:rPr>
-              <m:t>0</m:t>
+              <m:t>x0</m:t>
             </m:r>
           </m:e>
           <m:sub>
@@ -3931,14 +3962,7 @@
               <w:rFonts w:ascii="Cambria Math" w:eastAsiaTheme="minorEastAsia" w:hAnsi="Cambria Math" w:cs="Times New Roman"/>
               <w:lang w:val="en-US"/>
             </w:rPr>
-            <m:t>=</m:t>
-          </m:r>
-          <m:r>
-            <w:rPr>
-              <w:rFonts w:ascii="Cambria Math" w:eastAsiaTheme="minorEastAsia" w:hAnsi="Cambria Math" w:cs="Times New Roman"/>
-              <w:lang w:val="en-US"/>
-            </w:rPr>
-            <m:t>I</m:t>
+            <m:t>=I</m:t>
           </m:r>
           <m:sSub>
             <m:sSubPr>
@@ -4065,14 +4089,7 @@
                           <w:rFonts w:ascii="Cambria Math" w:eastAsiaTheme="minorEastAsia" w:hAnsi="Cambria Math" w:cs="Times New Roman"/>
                           <w:lang w:val="en-US"/>
                         </w:rPr>
-                        <m:t>i</m:t>
-                      </m:r>
-                      <m:r>
-                        <w:rPr>
-                          <w:rFonts w:ascii="Cambria Math" w:eastAsiaTheme="minorEastAsia" w:hAnsi="Cambria Math" w:cs="Times New Roman"/>
-                          <w:lang w:val="en-US"/>
-                        </w:rPr>
-                        <m:t>∈C</m:t>
+                        <m:t>i∈C</m:t>
                       </m:r>
                     </m:sub>
                     <m:sup>
@@ -4325,14 +4342,7 @@
             <w:rFonts w:ascii="Cambria Math" w:eastAsiaTheme="minorEastAsia" w:hAnsi="Cambria Math" w:cs="Times New Roman"/>
             <w:lang w:val="en-US"/>
           </w:rPr>
-          <m:t>C</m:t>
-        </m:r>
-        <m:r>
-          <w:rPr>
-            <w:rFonts w:ascii="Cambria Math" w:eastAsiaTheme="minorEastAsia" w:hAnsi="Cambria Math" w:cs="Times New Roman"/>
-            <w:lang w:val="en-US"/>
-          </w:rPr>
-          <m:t>⊂W</m:t>
+          <m:t>C⊂W</m:t>
         </m:r>
       </m:oMath>
       <w:r>
@@ -4434,14 +4444,7 @@
             <w:rFonts w:ascii="Cambria Math" w:eastAsiaTheme="minorEastAsia" w:hAnsi="Cambria Math" w:cs="Times New Roman"/>
             <w:lang w:val="en-US"/>
           </w:rPr>
-          <m:t>I</m:t>
-        </m:r>
-        <m:r>
-          <w:rPr>
-            <w:rFonts w:ascii="Cambria Math" w:eastAsiaTheme="minorEastAsia" w:hAnsi="Cambria Math" w:cs="Times New Roman"/>
-            <w:lang w:val="en-US"/>
-          </w:rPr>
-          <m:t>=</m:t>
+          <m:t>I=</m:t>
         </m:r>
         <m:f>
           <m:fPr>
@@ -6200,23 +6203,7 @@
           <w:rFonts w:ascii="Times New Roman" w:hAnsi="Times New Roman" w:cs="Times New Roman"/>
           <w:lang w:val="en-GB"/>
         </w:rPr>
-        <w:t xml:space="preserve">.7. All bonds </w:t>
-      </w:r>
-      <w:proofErr w:type="gramStart"/>
-      <w:r>
-        <w:rPr>
-          <w:rFonts w:ascii="Times New Roman" w:hAnsi="Times New Roman" w:cs="Times New Roman"/>
-          <w:lang w:val="en-GB"/>
-        </w:rPr>
-        <w:t>not present</w:t>
-      </w:r>
-      <w:proofErr w:type="gramEnd"/>
-      <w:r>
-        <w:rPr>
-          <w:rFonts w:ascii="Times New Roman" w:hAnsi="Times New Roman" w:cs="Times New Roman"/>
-          <w:lang w:val="en-GB"/>
-        </w:rPr>
-        <w:t xml:space="preserve"> in the given test item’s associated cluster would maintain </w:t>
+        <w:t xml:space="preserve">.7. All bonds not present in the given test item’s associated cluster would maintain </w:t>
       </w:r>
       <w:r>
         <w:rPr>
@@ -6262,21 +6249,7 @@
           <w:rFonts w:ascii="Times New Roman" w:hAnsi="Times New Roman" w:cs="Times New Roman"/>
           <w:lang w:val="en-GB"/>
         </w:rPr>
-        <w:t>The resulting correlation matrix</w:t>
-      </w:r>
-      <w:r>
-        <w:rPr>
-          <w:rFonts w:ascii="Times New Roman" w:hAnsi="Times New Roman" w:cs="Times New Roman"/>
-          <w:lang w:val="en-GB"/>
-        </w:rPr>
-        <w:t xml:space="preserve"> </w:t>
-      </w:r>
-      <w:r>
-        <w:rPr>
-          <w:rFonts w:ascii="Times New Roman" w:hAnsi="Times New Roman" w:cs="Times New Roman"/>
-          <w:lang w:val="en-GB"/>
-        </w:rPr>
-        <w:t>again produced the positive manifold</w:t>
+        <w:t>The resulting correlation matrix again produced the positive manifold</w:t>
       </w:r>
       <w:r>
         <w:rPr>
@@ -6518,14 +6491,7 @@
           <w:rFonts w:ascii="Times New Roman" w:hAnsi="Times New Roman" w:cs="Times New Roman"/>
           <w:lang w:val="en-GB"/>
         </w:rPr>
-        <w:t xml:space="preserve"> </w:t>
-      </w:r>
-      <w:r>
-        <w:rPr>
-          <w:rFonts w:ascii="Times New Roman" w:hAnsi="Times New Roman" w:cs="Times New Roman"/>
-          <w:lang w:val="en-GB"/>
-        </w:rPr>
-        <w:t xml:space="preserve">that the simulated </w:t>
+        <w:t xml:space="preserve"> that the simulated </w:t>
       </w:r>
       <w:r>
         <w:rPr>
@@ -7138,25 +7104,7 @@
           <w:color w:val="000000" w:themeColor="text1"/>
           <w:lang w:val="en-US"/>
         </w:rPr>
-        <w:t xml:space="preserve">Bartholomew, D. J., </w:t>
-      </w:r>
-      <w:proofErr w:type="spellStart"/>
-      <w:r>
-        <w:rPr>
-          <w:rFonts w:ascii="Times New Roman" w:eastAsia="Times New Roman" w:hAnsi="Times New Roman" w:cs="Times New Roman"/>
-          <w:color w:val="000000" w:themeColor="text1"/>
-          <w:lang w:val="en-US"/>
-        </w:rPr>
-        <w:t>Allerhand</w:t>
-      </w:r>
-      <w:proofErr w:type="spellEnd"/>
-      <w:r>
-        <w:rPr>
-          <w:rFonts w:ascii="Times New Roman" w:eastAsia="Times New Roman" w:hAnsi="Times New Roman" w:cs="Times New Roman"/>
-          <w:color w:val="000000" w:themeColor="text1"/>
-          <w:lang w:val="en-US"/>
-        </w:rPr>
-        <w:t xml:space="preserve">, M., &amp; Deary, I. J. (2013). Measuring mental capacity: Thomson’s Bonds model and Spearman’s g-model compared. Intelligence, 41(4), 222–233. </w:t>
+        <w:t xml:space="preserve">Bartholomew, D. J., Allerhand, M., &amp; Deary, I. J. (2013). Measuring mental capacity: Thomson’s Bonds model and Spearman’s g-model compared. Intelligence, 41(4), 222–233. </w:t>
       </w:r>
       <w:hyperlink r:id="rId5">
         <w:r>
@@ -7193,21 +7141,12 @@
         </w:rPr>
         <w:t xml:space="preserve">Bartholomew, D. J., Deary, I. J., &amp; Lawn, M. (2009a). A new lease of life for Thomson’s bonds model of intelligence. </w:t>
       </w:r>
-      <w:proofErr w:type="spellStart"/>
-      <w:r>
-        <w:rPr>
-          <w:rFonts w:ascii="Times New Roman" w:eastAsia="Times New Roman" w:hAnsi="Times New Roman" w:cs="Times New Roman"/>
-          <w:color w:val="000000" w:themeColor="text1"/>
-        </w:rPr>
-        <w:t>Psychological</w:t>
-      </w:r>
-      <w:proofErr w:type="spellEnd"/>
-      <w:r>
-        <w:rPr>
-          <w:rFonts w:ascii="Times New Roman" w:eastAsia="Times New Roman" w:hAnsi="Times New Roman" w:cs="Times New Roman"/>
-          <w:color w:val="000000" w:themeColor="text1"/>
-        </w:rPr>
-        <w:t xml:space="preserve"> Review, 116(3), 567–579. </w:t>
+      <w:r>
+        <w:rPr>
+          <w:rFonts w:ascii="Times New Roman" w:eastAsia="Times New Roman" w:hAnsi="Times New Roman" w:cs="Times New Roman"/>
+          <w:color w:val="000000" w:themeColor="text1"/>
+        </w:rPr>
+        <w:t xml:space="preserve">Psychological Review, 116(3), 567–579. </w:t>
       </w:r>
       <w:hyperlink r:id="rId6">
         <w:r>
@@ -7235,47 +7174,20 @@
           <w:lang w:val="en-GB"/>
         </w:rPr>
       </w:pPr>
-      <w:proofErr w:type="spellStart"/>
-      <w:r>
-        <w:rPr>
-          <w:rFonts w:ascii="Times New Roman" w:eastAsia="Times New Roman" w:hAnsi="Times New Roman" w:cs="Times New Roman"/>
-          <w:color w:val="000000" w:themeColor="text1"/>
-        </w:rPr>
-        <w:t>Savi</w:t>
-      </w:r>
-      <w:proofErr w:type="spellEnd"/>
-      <w:r>
-        <w:rPr>
-          <w:rFonts w:ascii="Times New Roman" w:eastAsia="Times New Roman" w:hAnsi="Times New Roman" w:cs="Times New Roman"/>
-          <w:color w:val="000000" w:themeColor="text1"/>
-        </w:rPr>
-        <w:t xml:space="preserve">, A. O., Marsman, M., van der Maas, H. L. J., &amp; Maris, G. K. J. (2019). </w:t>
-      </w:r>
-      <w:r>
-        <w:rPr>
-          <w:rFonts w:ascii="Times New Roman" w:eastAsia="Times New Roman" w:hAnsi="Times New Roman" w:cs="Times New Roman"/>
-          <w:color w:val="000000" w:themeColor="text1"/>
-          <w:lang w:val="en-US"/>
-        </w:rPr>
-        <w:t xml:space="preserve">The Wiring of Intelligence. Perspectives on psychological </w:t>
-      </w:r>
-      <w:proofErr w:type="gramStart"/>
-      <w:r>
-        <w:rPr>
-          <w:rFonts w:ascii="Times New Roman" w:eastAsia="Times New Roman" w:hAnsi="Times New Roman" w:cs="Times New Roman"/>
-          <w:color w:val="000000" w:themeColor="text1"/>
-          <w:lang w:val="en-US"/>
-        </w:rPr>
-        <w:t>science :</w:t>
-      </w:r>
-      <w:proofErr w:type="gramEnd"/>
-      <w:r>
-        <w:rPr>
-          <w:rFonts w:ascii="Times New Roman" w:eastAsia="Times New Roman" w:hAnsi="Times New Roman" w:cs="Times New Roman"/>
-          <w:color w:val="000000" w:themeColor="text1"/>
-          <w:lang w:val="en-US"/>
-        </w:rPr>
-        <w:t xml:space="preserve"> a journal of the Association for Psychological Science, 14(6), 1034–1061. </w:t>
+      <w:r>
+        <w:rPr>
+          <w:rFonts w:ascii="Times New Roman" w:eastAsia="Times New Roman" w:hAnsi="Times New Roman" w:cs="Times New Roman"/>
+          <w:color w:val="000000" w:themeColor="text1"/>
+        </w:rPr>
+        <w:t xml:space="preserve">Savi, A. O., Marsman, M., van der Maas, H. L. J., &amp; Maris, G. K. J. (2019). </w:t>
+      </w:r>
+      <w:r>
+        <w:rPr>
+          <w:rFonts w:ascii="Times New Roman" w:eastAsia="Times New Roman" w:hAnsi="Times New Roman" w:cs="Times New Roman"/>
+          <w:color w:val="000000" w:themeColor="text1"/>
+          <w:lang w:val="en-US"/>
+        </w:rPr>
+        <w:t xml:space="preserve">The Wiring of Intelligence. Perspectives on psychological science : a journal of the Association for Psychological Science, 14(6), 1034–1061. </w:t>
       </w:r>
       <w:hyperlink r:id="rId7">
         <w:r>
@@ -7328,9 +7240,6 @@
       <w:pPr>
         <w:spacing w:after="0" w:line="480" w:lineRule="auto"/>
         <w:ind w:left="709" w:hanging="709"/>
-        <w:rPr>
-          <w:rFonts w:ascii="Times New Roman" w:hAnsi="Times New Roman" w:cs="Times New Roman"/>
-        </w:rPr>
       </w:pPr>
       <w:r>
         <w:rPr>
@@ -7350,6 +7259,240 @@
           <w:t>https://doi.org/10.1080/1047840X.2016.1153946</w:t>
         </w:r>
       </w:hyperlink>
+    </w:p>
+    <w:p>
+      <w:r>
+        <w:br w:type="page"/>
+      </w:r>
+    </w:p>
+    <w:p>
+      <w:pPr>
+        <w:spacing w:after="0" w:line="480" w:lineRule="auto"/>
+        <w:ind w:left="709" w:hanging="709"/>
+        <w:rPr>
+          <w:rFonts w:ascii="Times New Roman" w:hAnsi="Times New Roman" w:cs="Times New Roman"/>
+        </w:rPr>
+      </w:pPr>
+      <w:r>
+        <w:rPr>
+          <w:rFonts w:ascii="Times New Roman" w:hAnsi="Times New Roman" w:cs="Times New Roman"/>
+        </w:rPr>
+        <w:lastRenderedPageBreak/>
+        <w:t>Group member contribution statement</w:t>
+      </w:r>
+    </w:p>
+    <w:p>
+      <w:pPr>
+        <w:spacing w:after="0" w:line="480" w:lineRule="auto"/>
+        <w:ind w:left="709" w:hanging="709"/>
+        <w:rPr>
+          <w:rFonts w:ascii="Times New Roman" w:hAnsi="Times New Roman" w:cs="Times New Roman"/>
+        </w:rPr>
+      </w:pPr>
+    </w:p>
+    <w:p>
+      <w:pPr>
+        <w:spacing w:after="0" w:line="480" w:lineRule="auto"/>
+        <w:ind w:left="709" w:hanging="709"/>
+        <w:rPr>
+          <w:rFonts w:ascii="Times New Roman" w:hAnsi="Times New Roman" w:cs="Times New Roman"/>
+        </w:rPr>
+      </w:pPr>
+      <w:r>
+        <w:rPr>
+          <w:rFonts w:ascii="Times New Roman" w:hAnsi="Times New Roman" w:cs="Times New Roman"/>
+        </w:rPr>
+        <w:t>Daan:</w:t>
+      </w:r>
+    </w:p>
+    <w:p>
+      <w:pPr>
+        <w:pStyle w:val="ListParagraph"/>
+        <w:numPr>
+          <w:ilvl w:val="0"/>
+          <w:numId w:val="3"/>
+        </w:numPr>
+        <w:spacing w:after="0" w:line="480" w:lineRule="auto"/>
+        <w:rPr>
+          <w:rFonts w:ascii="Times New Roman" w:hAnsi="Times New Roman" w:cs="Times New Roman"/>
+        </w:rPr>
+      </w:pPr>
+      <w:r>
+        <w:rPr>
+          <w:rFonts w:ascii="Times New Roman" w:hAnsi="Times New Roman" w:cs="Times New Roman"/>
+        </w:rPr>
+        <w:t>Primary contributor to overlap extention of mutalism model</w:t>
+      </w:r>
+    </w:p>
+    <w:p>
+      <w:pPr>
+        <w:spacing w:after="0" w:line="480" w:lineRule="auto"/>
+        <w:rPr>
+          <w:rFonts w:ascii="Times New Roman" w:hAnsi="Times New Roman" w:cs="Times New Roman"/>
+        </w:rPr>
+      </w:pPr>
+    </w:p>
+    <w:p>
+      <w:pPr>
+        <w:spacing w:after="0" w:line="480" w:lineRule="auto"/>
+        <w:rPr>
+          <w:rFonts w:ascii="Times New Roman" w:hAnsi="Times New Roman" w:cs="Times New Roman"/>
+        </w:rPr>
+      </w:pPr>
+      <w:r>
+        <w:rPr>
+          <w:rFonts w:ascii="Times New Roman" w:hAnsi="Times New Roman" w:cs="Times New Roman"/>
+        </w:rPr>
+        <w:t>Claire</w:t>
+      </w:r>
+    </w:p>
+    <w:p>
+      <w:pPr>
+        <w:pStyle w:val="ListParagraph"/>
+        <w:numPr>
+          <w:ilvl w:val="0"/>
+          <w:numId w:val="3"/>
+        </w:numPr>
+        <w:spacing w:after="0" w:line="480" w:lineRule="auto"/>
+        <w:rPr>
+          <w:rFonts w:ascii="Times New Roman" w:hAnsi="Times New Roman" w:cs="Times New Roman"/>
+        </w:rPr>
+      </w:pPr>
+      <w:r>
+        <w:rPr>
+          <w:rFonts w:ascii="Times New Roman" w:hAnsi="Times New Roman" w:cs="Times New Roman"/>
+        </w:rPr>
+        <w:t>Primary contributor to simulation of bonds data</w:t>
+      </w:r>
+    </w:p>
+    <w:p>
+      <w:pPr>
+        <w:spacing w:after="0" w:line="480" w:lineRule="auto"/>
+        <w:rPr>
+          <w:rFonts w:ascii="Times New Roman" w:hAnsi="Times New Roman" w:cs="Times New Roman"/>
+        </w:rPr>
+      </w:pPr>
+    </w:p>
+    <w:p>
+      <w:pPr>
+        <w:spacing w:after="0" w:line="480" w:lineRule="auto"/>
+        <w:rPr>
+          <w:rFonts w:ascii="Times New Roman" w:hAnsi="Times New Roman" w:cs="Times New Roman"/>
+        </w:rPr>
+      </w:pPr>
+      <w:r>
+        <w:rPr>
+          <w:rFonts w:ascii="Times New Roman" w:hAnsi="Times New Roman" w:cs="Times New Roman"/>
+        </w:rPr>
+        <w:t>Tess</w:t>
+      </w:r>
+    </w:p>
+    <w:p>
+      <w:pPr>
+        <w:pStyle w:val="ListParagraph"/>
+        <w:numPr>
+          <w:ilvl w:val="0"/>
+          <w:numId w:val="3"/>
+        </w:numPr>
+        <w:spacing w:after="0" w:line="480" w:lineRule="auto"/>
+        <w:rPr>
+          <w:rFonts w:ascii="Times New Roman" w:hAnsi="Times New Roman" w:cs="Times New Roman"/>
+        </w:rPr>
+      </w:pPr>
+      <w:r>
+        <w:rPr>
+          <w:rFonts w:ascii="Times New Roman" w:hAnsi="Times New Roman" w:cs="Times New Roman"/>
+        </w:rPr>
+        <w:t>Primary contributor to clustered bonds simulation</w:t>
+      </w:r>
+    </w:p>
+    <w:p>
+      <w:pPr>
+        <w:spacing w:after="0" w:line="480" w:lineRule="auto"/>
+        <w:rPr>
+          <w:rFonts w:ascii="Times New Roman" w:hAnsi="Times New Roman" w:cs="Times New Roman"/>
+        </w:rPr>
+      </w:pPr>
+    </w:p>
+    <w:p>
+      <w:pPr>
+        <w:spacing w:after="0" w:line="480" w:lineRule="auto"/>
+        <w:rPr>
+          <w:rFonts w:ascii="Times New Roman" w:hAnsi="Times New Roman" w:cs="Times New Roman"/>
+        </w:rPr>
+      </w:pPr>
+      <w:r>
+        <w:rPr>
+          <w:rFonts w:ascii="Times New Roman" w:hAnsi="Times New Roman" w:cs="Times New Roman"/>
+        </w:rPr>
+        <w:t>Shared responcibilites</w:t>
+      </w:r>
+    </w:p>
+    <w:p>
+      <w:pPr>
+        <w:pStyle w:val="ListParagraph"/>
+        <w:numPr>
+          <w:ilvl w:val="0"/>
+          <w:numId w:val="3"/>
+        </w:numPr>
+        <w:spacing w:after="0" w:line="480" w:lineRule="auto"/>
+        <w:rPr>
+          <w:rFonts w:ascii="Times New Roman" w:hAnsi="Times New Roman" w:cs="Times New Roman"/>
+        </w:rPr>
+      </w:pPr>
+      <w:r>
+        <w:rPr>
+          <w:rFonts w:ascii="Times New Roman" w:hAnsi="Times New Roman" w:cs="Times New Roman"/>
+        </w:rPr>
+        <w:t>Report writing</w:t>
+      </w:r>
+    </w:p>
+    <w:p>
+      <w:pPr>
+        <w:pStyle w:val="ListParagraph"/>
+        <w:numPr>
+          <w:ilvl w:val="0"/>
+          <w:numId w:val="3"/>
+        </w:numPr>
+        <w:spacing w:after="0" w:line="480" w:lineRule="auto"/>
+        <w:rPr>
+          <w:rFonts w:ascii="Times New Roman" w:hAnsi="Times New Roman" w:cs="Times New Roman"/>
+        </w:rPr>
+      </w:pPr>
+      <w:r>
+        <w:rPr>
+          <w:rFonts w:ascii="Times New Roman" w:hAnsi="Times New Roman" w:cs="Times New Roman"/>
+        </w:rPr>
+        <w:t>All-team discussions</w:t>
+      </w:r>
+    </w:p>
+    <w:p>
+      <w:pPr>
+        <w:pStyle w:val="ListParagraph"/>
+        <w:numPr>
+          <w:ilvl w:val="0"/>
+          <w:numId w:val="3"/>
+        </w:numPr>
+        <w:spacing w:after="0" w:line="480" w:lineRule="auto"/>
+        <w:rPr>
+          <w:rFonts w:ascii="Times New Roman" w:hAnsi="Times New Roman" w:cs="Times New Roman"/>
+        </w:rPr>
+      </w:pPr>
+      <w:r>
+        <w:rPr>
+          <w:rFonts w:ascii="Times New Roman" w:hAnsi="Times New Roman" w:cs="Times New Roman"/>
+        </w:rPr>
+        <w:t>Presentation slides and preparation</w:t>
+      </w:r>
+    </w:p>
+    <w:p>
+      <w:pPr>
+        <w:spacing w:after="0" w:line="480" w:lineRule="auto"/>
+        <w:ind w:left="709" w:hanging="709"/>
+        <w:rPr>
+          <w:rFonts w:ascii="Times New Roman" w:hAnsi="Times New Roman" w:cs="Times New Roman"/>
+        </w:rPr>
+      </w:pPr>
     </w:p>
     <w:sectPr>
       <w:pgSz w:w="11906" w:h="16838"/>
@@ -7636,11 +7779,126 @@
       </w:rPr>
     </w:lvl>
   </w:abstractNum>
+  <w:abstractNum w:abstractNumId="2" w15:restartNumberingAfterBreak="0">
+    <w:nsid w:val="70215FC1"/>
+    <w:multiLevelType w:val="hybridMultilevel"/>
+    <w:tmpl w:val="34AC300E"/>
+    <w:lvl w:ilvl="0" w:tplc="9B7E9652">
+      <w:numFmt w:val="bullet"/>
+      <w:lvlText w:val="-"/>
+      <w:lvlJc w:val="left"/>
+      <w:pPr>
+        <w:ind w:left="720" w:hanging="360"/>
+      </w:pPr>
+      <w:rPr>
+        <w:rFonts w:ascii="Times New Roman" w:eastAsiaTheme="minorHAnsi" w:hAnsi="Times New Roman" w:cs="Times New Roman" w:hint="default"/>
+      </w:rPr>
+    </w:lvl>
+    <w:lvl w:ilvl="1" w:tplc="04090003" w:tentative="1">
+      <w:start w:val="1"/>
+      <w:numFmt w:val="bullet"/>
+      <w:lvlText w:val="o"/>
+      <w:lvlJc w:val="left"/>
+      <w:pPr>
+        <w:ind w:left="1440" w:hanging="360"/>
+      </w:pPr>
+      <w:rPr>
+        <w:rFonts w:ascii="Courier New" w:hAnsi="Courier New" w:cs="Courier New" w:hint="default"/>
+      </w:rPr>
+    </w:lvl>
+    <w:lvl w:ilvl="2" w:tplc="04090005" w:tentative="1">
+      <w:start w:val="1"/>
+      <w:numFmt w:val="bullet"/>
+      <w:lvlText w:val=""/>
+      <w:lvlJc w:val="left"/>
+      <w:pPr>
+        <w:ind w:left="2160" w:hanging="360"/>
+      </w:pPr>
+      <w:rPr>
+        <w:rFonts w:ascii="Wingdings" w:hAnsi="Wingdings" w:hint="default"/>
+      </w:rPr>
+    </w:lvl>
+    <w:lvl w:ilvl="3" w:tplc="04090001" w:tentative="1">
+      <w:start w:val="1"/>
+      <w:numFmt w:val="bullet"/>
+      <w:lvlText w:val=""/>
+      <w:lvlJc w:val="left"/>
+      <w:pPr>
+        <w:ind w:left="2880" w:hanging="360"/>
+      </w:pPr>
+      <w:rPr>
+        <w:rFonts w:ascii="Symbol" w:hAnsi="Symbol" w:hint="default"/>
+      </w:rPr>
+    </w:lvl>
+    <w:lvl w:ilvl="4" w:tplc="04090003" w:tentative="1">
+      <w:start w:val="1"/>
+      <w:numFmt w:val="bullet"/>
+      <w:lvlText w:val="o"/>
+      <w:lvlJc w:val="left"/>
+      <w:pPr>
+        <w:ind w:left="3600" w:hanging="360"/>
+      </w:pPr>
+      <w:rPr>
+        <w:rFonts w:ascii="Courier New" w:hAnsi="Courier New" w:cs="Courier New" w:hint="default"/>
+      </w:rPr>
+    </w:lvl>
+    <w:lvl w:ilvl="5" w:tplc="04090005" w:tentative="1">
+      <w:start w:val="1"/>
+      <w:numFmt w:val="bullet"/>
+      <w:lvlText w:val=""/>
+      <w:lvlJc w:val="left"/>
+      <w:pPr>
+        <w:ind w:left="4320" w:hanging="360"/>
+      </w:pPr>
+      <w:rPr>
+        <w:rFonts w:ascii="Wingdings" w:hAnsi="Wingdings" w:hint="default"/>
+      </w:rPr>
+    </w:lvl>
+    <w:lvl w:ilvl="6" w:tplc="04090001" w:tentative="1">
+      <w:start w:val="1"/>
+      <w:numFmt w:val="bullet"/>
+      <w:lvlText w:val=""/>
+      <w:lvlJc w:val="left"/>
+      <w:pPr>
+        <w:ind w:left="5040" w:hanging="360"/>
+      </w:pPr>
+      <w:rPr>
+        <w:rFonts w:ascii="Symbol" w:hAnsi="Symbol" w:hint="default"/>
+      </w:rPr>
+    </w:lvl>
+    <w:lvl w:ilvl="7" w:tplc="04090003" w:tentative="1">
+      <w:start w:val="1"/>
+      <w:numFmt w:val="bullet"/>
+      <w:lvlText w:val="o"/>
+      <w:lvlJc w:val="left"/>
+      <w:pPr>
+        <w:ind w:left="5760" w:hanging="360"/>
+      </w:pPr>
+      <w:rPr>
+        <w:rFonts w:ascii="Courier New" w:hAnsi="Courier New" w:cs="Courier New" w:hint="default"/>
+      </w:rPr>
+    </w:lvl>
+    <w:lvl w:ilvl="8" w:tplc="04090005" w:tentative="1">
+      <w:start w:val="1"/>
+      <w:numFmt w:val="bullet"/>
+      <w:lvlText w:val=""/>
+      <w:lvlJc w:val="left"/>
+      <w:pPr>
+        <w:ind w:left="6480" w:hanging="360"/>
+      </w:pPr>
+      <w:rPr>
+        <w:rFonts w:ascii="Wingdings" w:hAnsi="Wingdings" w:hint="default"/>
+      </w:rPr>
+    </w:lvl>
+  </w:abstractNum>
   <w:num w:numId="1" w16cid:durableId="460805705">
     <w:abstractNumId w:val="0"/>
   </w:num>
   <w:num w:numId="2" w16cid:durableId="1027289400">
     <w:abstractNumId w:val="1"/>
+  </w:num>
+  <w:num w:numId="3" w16cid:durableId="2089301620">
+    <w:abstractNumId w:val="2"/>
   </w:num>
 </w:numbering>
 </file>

</xml_diff>